<commit_message>
feat(ksp): 12pt font, Page 2 start, lesson screenshot, eye button for Google Docs, no whiteboard or laptops
</commit_message>
<xml_diff>
--- a/Личный кабинет/ksp_template.docx
+++ b/Личный кабинет/ksp_template.docx
@@ -2020,90 +2020,6 @@
                 <w:rFonts w:ascii="Times New Roman" w:hAnsi="Times New Roman" w:cs="Times New Roman"/>
                 <w:sz w:val="24"/>
                 <w:szCs w:val="24"/>
-                <w:lang w:val="ru-RU"/>
-              </w:rPr>
-            </w:pPr>
-            <w:r>
-              <w:rPr>
-                <w:rFonts w:ascii="Times New Roman" w:hAnsi="Times New Roman" w:cs="Times New Roman"/>
-                <w:noProof/>
-                <w:sz w:val="24"/>
-                <w:szCs w:val="24"/>
-              </w:rPr>
-              <w:drawing>
-                <wp:anchor distT="0" distB="0" distL="114300" distR="114300" simplePos="0" relativeHeight="251658240" behindDoc="0" locked="0" layoutInCell="1" allowOverlap="1" wp14:anchorId="1088EB73" wp14:editId="46125567">
-                  <wp:simplePos x="0" y="0"/>
-                  <wp:positionH relativeFrom="column">
-                    <wp:posOffset>27305</wp:posOffset>
-                  </wp:positionH>
-                  <wp:positionV relativeFrom="paragraph">
-                    <wp:posOffset>49530</wp:posOffset>
-                  </wp:positionV>
-                  <wp:extent cx="2714625" cy="1782445"/>
-                  <wp:effectExtent l="0" t="0" r="9525" b="8255"/>
-                  <wp:wrapSquare wrapText="bothSides"/>
-                  <wp:docPr id="239671454" name="Рисунок 1"/>
-                  <wp:cNvGraphicFramePr>
-                    <a:graphicFrameLocks xmlns:a="http://schemas.openxmlformats.org/drawingml/2006/main" noChangeAspect="1"/>
-                  </wp:cNvGraphicFramePr>
-                  <a:graphic xmlns:a="http://schemas.openxmlformats.org/drawingml/2006/main">
-                    <a:graphicData uri="http://schemas.openxmlformats.org/drawingml/2006/picture">
-                      <pic:pic xmlns:pic="http://schemas.openxmlformats.org/drawingml/2006/picture">
-                        <pic:nvPicPr>
-                          <pic:cNvPr id="239671454" name=""/>
-                          <pic:cNvPicPr/>
-                        </pic:nvPicPr>
-                        <pic:blipFill>
-                          <a:blip r:embed="rId9" cstate="print">
-                            <a:extLst>
-                              <a:ext uri="{28A0092B-C50C-407E-A947-70E740481C1C}">
-                                <a14:useLocalDpi xmlns:a14="http://schemas.microsoft.com/office/drawing/2010/main" val="0"/>
-                              </a:ext>
-                            </a:extLst>
-                          </a:blip>
-                          <a:stretch>
-                            <a:fillRect/>
-                          </a:stretch>
-                        </pic:blipFill>
-                        <pic:spPr>
-                          <a:xfrm>
-                            <a:off x="0" y="0"/>
-                            <a:ext cx="2714625" cy="1782445"/>
-                          </a:xfrm>
-                          <a:prstGeom prst="rect">
-                            <a:avLst/>
-                          </a:prstGeom>
-                        </pic:spPr>
-                      </pic:pic>
-                    </a:graphicData>
-                  </a:graphic>
-                  <wp14:sizeRelH relativeFrom="margin">
-                    <wp14:pctWidth>0</wp14:pctWidth>
-                  </wp14:sizeRelH>
-                  <wp14:sizeRelV relativeFrom="margin">
-                    <wp14:pctHeight>0</wp14:pctHeight>
-                  </wp14:sizeRelV>
-                </wp:anchor>
-              </w:drawing>
-            </w:r>
-            <w:r>
-              <w:rPr>
-                <w:rFonts w:ascii="Times New Roman" w:hAnsi="Times New Roman" w:cs="Times New Roman"/>
-                <w:sz w:val="24"/>
-                <w:szCs w:val="24"/>
-                <w:lang w:val="ru-RU"/>
-              </w:rPr>
-              <w:t>Отвечают на вопросы на платформе</w:t>
-            </w:r>
-          </w:p>
-          <w:p>
-            <w:pPr>
-              <w:spacing w:after="120"/>
-              <w:jc w:val="both"/>
-              <w:rPr>
-                <w:rFonts w:ascii="Times New Roman" w:hAnsi="Times New Roman" w:cs="Times New Roman"/>
-                <w:sz w:val="24"/>
-                <w:szCs w:val="24"/>
               </w:rPr>
             </w:pPr>
             <w:r>
@@ -2792,141 +2708,11 @@
             </w:pPr>
             <w:r>
               <w:rPr>
-                <w:noProof/>
-              </w:rPr>
-              <w:drawing>
-                <wp:anchor distT="0" distB="0" distL="114300" distR="114300" simplePos="0" relativeHeight="251659264" behindDoc="0" locked="0" layoutInCell="1" allowOverlap="1" wp14:anchorId="5DB7DDB9" wp14:editId="2E7E7F2A">
-                  <wp:simplePos x="0" y="0"/>
-                  <wp:positionH relativeFrom="column">
-                    <wp:posOffset>66675</wp:posOffset>
-                  </wp:positionH>
-                  <wp:positionV relativeFrom="paragraph">
-                    <wp:posOffset>250825</wp:posOffset>
-                  </wp:positionV>
-                  <wp:extent cx="2943225" cy="1149985"/>
-                  <wp:effectExtent l="0" t="0" r="9525" b="0"/>
-                  <wp:wrapSquare wrapText="bothSides"/>
-                  <wp:docPr id="262602997" name="Рисунок 1"/>
-                  <wp:cNvGraphicFramePr>
-                    <a:graphicFrameLocks xmlns:a="http://schemas.openxmlformats.org/drawingml/2006/main" noChangeAspect="1"/>
-                  </wp:cNvGraphicFramePr>
-                  <a:graphic xmlns:a="http://schemas.openxmlformats.org/drawingml/2006/main">
-                    <a:graphicData uri="http://schemas.openxmlformats.org/drawingml/2006/picture">
-                      <pic:pic xmlns:pic="http://schemas.openxmlformats.org/drawingml/2006/picture">
-                        <pic:nvPicPr>
-                          <pic:cNvPr id="262602997" name=""/>
-                          <pic:cNvPicPr/>
-                        </pic:nvPicPr>
-                        <pic:blipFill>
-                          <a:blip r:embed="rId10" cstate="print">
-                            <a:extLst>
-                              <a:ext uri="{28A0092B-C50C-407E-A947-70E740481C1C}">
-                                <a14:useLocalDpi xmlns:a14="http://schemas.microsoft.com/office/drawing/2010/main" val="0"/>
-                              </a:ext>
-                            </a:extLst>
-                          </a:blip>
-                          <a:stretch>
-                            <a:fillRect/>
-                          </a:stretch>
-                        </pic:blipFill>
-                        <pic:spPr>
-                          <a:xfrm>
-                            <a:off x="0" y="0"/>
-                            <a:ext cx="2943225" cy="1149985"/>
-                          </a:xfrm>
-                          <a:prstGeom prst="rect">
-                            <a:avLst/>
-                          </a:prstGeom>
-                        </pic:spPr>
-                      </pic:pic>
-                    </a:graphicData>
-                  </a:graphic>
-                  <wp14:sizeRelH relativeFrom="margin">
-                    <wp14:pctWidth>0</wp14:pctWidth>
-                  </wp14:sizeRelH>
-                  <wp14:sizeRelV relativeFrom="margin">
-                    <wp14:pctHeight>0</wp14:pctHeight>
-                  </wp14:sizeRelV>
-                </wp:anchor>
-              </w:drawing>
-            </w:r>
-            <w:r>
-              <w:rPr>
-                <w:rFonts w:ascii="Times New Roman" w:hAnsi="Times New Roman" w:cs="Times New Roman"/>
-                <w:sz w:val="24"/>
-                <w:szCs w:val="24"/>
-              </w:rPr>
-              <w:t>Конспектирование в тетради основные моменты</w:t>
-            </w:r>
-          </w:p>
-          <w:p>
-            <w:pPr>
-              <w:spacing w:after="120"/>
-              <w:rPr>
-                <w:rFonts w:ascii="Times New Roman" w:hAnsi="Times New Roman" w:cs="Times New Roman"/>
-                <w:sz w:val="24"/>
-                <w:szCs w:val="24"/>
-              </w:rPr>
-            </w:pPr>
-            <w:r>
-              <w:rPr>
                 <w:rFonts w:ascii="Times New Roman" w:hAnsi="Times New Roman" w:cs="Times New Roman"/>
                 <w:sz w:val="24"/>
                 <w:szCs w:val="24"/>
               </w:rPr>
               <w:t>Контроль теоретических знаний учащихся</w:t>
-            </w:r>
-          </w:p>
-          <w:p>
-            <w:pPr>
-              <w:spacing w:after="120"/>
-              <w:rPr>
-                <w:rFonts w:ascii="Times New Roman" w:hAnsi="Times New Roman" w:cs="Times New Roman"/>
-                <w:sz w:val="24"/>
-                <w:szCs w:val="24"/>
-              </w:rPr>
-            </w:pPr>
-            <w:r>
-              <w:rPr>
-                <w:rFonts w:ascii="Times New Roman" w:hAnsi="Times New Roman" w:cs="Times New Roman"/>
-                <w:sz w:val="24"/>
-                <w:szCs w:val="24"/>
-              </w:rPr>
-              <w:drawing>
-                <wp:inline distT="0" distB="0" distL="0" distR="0" wp14:anchorId="144B7D01" wp14:editId="1F4817E4">
-                  <wp:extent cx="3105150" cy="1907448"/>
-                  <wp:effectExtent l="0" t="0" r="0" b="0"/>
-                  <wp:docPr id="580149971" name="Рисунок 1"/>
-                  <wp:cNvGraphicFramePr>
-                    <a:graphicFrameLocks xmlns:a="http://schemas.openxmlformats.org/drawingml/2006/main" noChangeAspect="1"/>
-                  </wp:cNvGraphicFramePr>
-                  <a:graphic xmlns:a="http://schemas.openxmlformats.org/drawingml/2006/main">
-                    <a:graphicData uri="http://schemas.openxmlformats.org/drawingml/2006/picture">
-                      <pic:pic xmlns:pic="http://schemas.openxmlformats.org/drawingml/2006/picture">
-                        <pic:nvPicPr>
-                          <pic:cNvPr id="580149971" name=""/>
-                          <pic:cNvPicPr/>
-                        </pic:nvPicPr>
-                        <pic:blipFill>
-                          <a:blip r:embed="rId11"/>
-                          <a:stretch>
-                            <a:fillRect/>
-                          </a:stretch>
-                        </pic:blipFill>
-                        <pic:spPr>
-                          <a:xfrm>
-                            <a:off x="0" y="0"/>
-                            <a:ext cx="3133349" cy="1924770"/>
-                          </a:xfrm>
-                          <a:prstGeom prst="rect">
-                            <a:avLst/>
-                          </a:prstGeom>
-                        </pic:spPr>
-                      </pic:pic>
-                    </a:graphicData>
-                  </a:graphic>
-                </wp:inline>
-              </w:drawing>
             </w:r>
           </w:p>
           <w:p>
@@ -3583,89 +3369,6 @@
           <w:p>
             <w:pPr>
               <w:spacing w:after="120"/>
-              <w:jc w:val="both"/>
-              <w:rPr>
-                <w:rFonts w:ascii="Times New Roman" w:hAnsi="Times New Roman" w:cs="Times New Roman"/>
-                <w:sz w:val="24"/>
-                <w:szCs w:val="24"/>
-              </w:rPr>
-            </w:pPr>
-            <w:r>
-              <w:rPr>
-                <w:rFonts w:ascii="Times New Roman" w:hAnsi="Times New Roman" w:cs="Times New Roman"/>
-                <w:noProof/>
-                <w:sz w:val="24"/>
-                <w:szCs w:val="24"/>
-                <w:lang w:val="ru-RU"/>
-              </w:rPr>
-              <w:drawing>
-                <wp:anchor distT="0" distB="0" distL="114300" distR="114300" simplePos="0" relativeHeight="251661312" behindDoc="0" locked="0" layoutInCell="1" allowOverlap="1" wp14:anchorId="50E1B121" wp14:editId="7ABFB02B">
-                  <wp:simplePos x="0" y="0"/>
-                  <wp:positionH relativeFrom="column">
-                    <wp:posOffset>-19050</wp:posOffset>
-                  </wp:positionH>
-                  <wp:positionV relativeFrom="paragraph">
-                    <wp:posOffset>501650</wp:posOffset>
-                  </wp:positionV>
-                  <wp:extent cx="3171825" cy="1464945"/>
-                  <wp:effectExtent l="0" t="0" r="9525" b="1905"/>
-                  <wp:wrapSquare wrapText="bothSides"/>
-                  <wp:docPr id="578430606" name="Рисунок 1"/>
-                  <wp:cNvGraphicFramePr>
-                    <a:graphicFrameLocks xmlns:a="http://schemas.openxmlformats.org/drawingml/2006/main" noChangeAspect="1"/>
-                  </wp:cNvGraphicFramePr>
-                  <a:graphic xmlns:a="http://schemas.openxmlformats.org/drawingml/2006/main">
-                    <a:graphicData uri="http://schemas.openxmlformats.org/drawingml/2006/picture">
-                      <pic:pic xmlns:pic="http://schemas.openxmlformats.org/drawingml/2006/picture">
-                        <pic:nvPicPr>
-                          <pic:cNvPr id="1664205535" name=""/>
-                          <pic:cNvPicPr/>
-                        </pic:nvPicPr>
-                        <pic:blipFill>
-                          <a:blip r:embed="rId12">
-                            <a:extLst>
-                              <a:ext uri="{28A0092B-C50C-407E-A947-70E740481C1C}">
-                                <a14:useLocalDpi xmlns:a14="http://schemas.microsoft.com/office/drawing/2010/main" val="0"/>
-                              </a:ext>
-                            </a:extLst>
-                          </a:blip>
-                          <a:stretch>
-                            <a:fillRect/>
-                          </a:stretch>
-                        </pic:blipFill>
-                        <pic:spPr>
-                          <a:xfrm>
-                            <a:off x="0" y="0"/>
-                            <a:ext cx="3171825" cy="1464945"/>
-                          </a:xfrm>
-                          <a:prstGeom prst="rect">
-                            <a:avLst/>
-                          </a:prstGeom>
-                        </pic:spPr>
-                      </pic:pic>
-                    </a:graphicData>
-                  </a:graphic>
-                  <wp14:sizeRelH relativeFrom="margin">
-                    <wp14:pctWidth>0</wp14:pctWidth>
-                  </wp14:sizeRelH>
-                  <wp14:sizeRelV relativeFrom="margin">
-                    <wp14:pctHeight>0</wp14:pctHeight>
-                  </wp14:sizeRelV>
-                </wp:anchor>
-              </w:drawing>
-            </w:r>
-            <w:r>
-              <w:rPr>
-                <w:rFonts w:ascii="Times New Roman" w:hAnsi="Times New Roman" w:cs="Times New Roman"/>
-                <w:sz w:val="24"/>
-                <w:szCs w:val="24"/>
-              </w:rPr>
-              <w:t>Использование знаний полученные в теории и выполнение практического задания.</w:t>
-            </w:r>
-          </w:p>
-          <w:p>
-            <w:pPr>
-              <w:spacing w:after="120"/>
               <w:rPr>
                 <w:rFonts w:ascii="Times New Roman" w:hAnsi="Times New Roman" w:cs="Times New Roman"/>
                 <w:sz w:val="24"/>
@@ -3948,164 +3651,6 @@
           <w:tcPr>
             <w:tcW w:w="3702" w:type="dxa"/>
           </w:tcPr>
-          <w:p>
-            <w:pPr>
-              <w:spacing w:after="120"/>
-              <w:jc w:val="both"/>
-              <w:rPr>
-                <w:rFonts w:ascii="Times New Roman" w:hAnsi="Times New Roman" w:cs="Times New Roman"/>
-                <w:sz w:val="24"/>
-                <w:szCs w:val="24"/>
-              </w:rPr>
-            </w:pPr>
-            <w:r>
-              <w:rPr>
-                <w:rFonts w:ascii="Times New Roman" w:hAnsi="Times New Roman" w:cs="Times New Roman"/>
-                <w:noProof/>
-                <w:sz w:val="24"/>
-                <w:szCs w:val="24"/>
-              </w:rPr>
-              <w:drawing>
-                <wp:anchor distT="0" distB="0" distL="114300" distR="114300" simplePos="0" relativeHeight="251662336" behindDoc="0" locked="0" layoutInCell="1" allowOverlap="1" wp14:anchorId="5C96AFE0" wp14:editId="25BF1F9F">
-                  <wp:simplePos x="0" y="0"/>
-                  <wp:positionH relativeFrom="column">
-                    <wp:posOffset>30790</wp:posOffset>
-                  </wp:positionH>
-                  <wp:positionV relativeFrom="paragraph">
-                    <wp:posOffset>651540</wp:posOffset>
-                  </wp:positionV>
-                  <wp:extent cx="3174365" cy="2243455"/>
-                  <wp:effectExtent l="0" t="0" r="6985" b="4445"/>
-                  <wp:wrapSquare wrapText="bothSides"/>
-                  <wp:docPr id="22904411" name="Рисунок 1"/>
-                  <wp:cNvGraphicFramePr>
-                    <a:graphicFrameLocks xmlns:a="http://schemas.openxmlformats.org/drawingml/2006/main" noChangeAspect="1"/>
-                  </wp:cNvGraphicFramePr>
-                  <a:graphic xmlns:a="http://schemas.openxmlformats.org/drawingml/2006/main">
-                    <a:graphicData uri="http://schemas.openxmlformats.org/drawingml/2006/picture">
-                      <pic:pic xmlns:pic="http://schemas.openxmlformats.org/drawingml/2006/picture">
-                        <pic:nvPicPr>
-                          <pic:cNvPr id="22904411" name=""/>
-                          <pic:cNvPicPr/>
-                        </pic:nvPicPr>
-                        <pic:blipFill>
-                          <a:blip r:embed="rId13">
-                            <a:extLst>
-                              <a:ext uri="{28A0092B-C50C-407E-A947-70E740481C1C}">
-                                <a14:useLocalDpi xmlns:a14="http://schemas.microsoft.com/office/drawing/2010/main" val="0"/>
-                              </a:ext>
-                            </a:extLst>
-                          </a:blip>
-                          <a:stretch>
-                            <a:fillRect/>
-                          </a:stretch>
-                        </pic:blipFill>
-                        <pic:spPr>
-                          <a:xfrm>
-                            <a:off x="0" y="0"/>
-                            <a:ext cx="3174365" cy="2243455"/>
-                          </a:xfrm>
-                          <a:prstGeom prst="rect">
-                            <a:avLst/>
-                          </a:prstGeom>
-                        </pic:spPr>
-                      </pic:pic>
-                    </a:graphicData>
-                  </a:graphic>
-                </wp:anchor>
-              </w:drawing>
-            </w:r>
-            <w:r>
-              <w:rPr>
-                <w:rFonts w:ascii="Times New Roman" w:hAnsi="Times New Roman" w:cs="Times New Roman"/>
-                <w:sz w:val="24"/>
-                <w:szCs w:val="24"/>
-              </w:rPr>
-              <w:t>Обучающийся выполняет задания с поддержкой «помощника» на сайте или по адаптированному рабочему листу.</w:t>
-            </w:r>
-          </w:p>
-          <w:p>
-            <w:pPr>
-              <w:spacing w:after="120"/>
-              <w:jc w:val="both"/>
-              <w:rPr>
-                <w:rFonts w:ascii="Times New Roman" w:hAnsi="Times New Roman" w:cs="Times New Roman"/>
-                <w:sz w:val="24"/>
-                <w:szCs w:val="24"/>
-              </w:rPr>
-            </w:pPr>
-            <w:r>
-              <w:rPr>
-                <w:rFonts w:ascii="Times New Roman" w:hAnsi="Times New Roman" w:cs="Times New Roman"/>
-                <w:noProof/>
-                <w:sz w:val="24"/>
-                <w:szCs w:val="24"/>
-                <w:lang w:val="ru-RU"/>
-              </w:rPr>
-              <w:drawing>
-                <wp:anchor distT="0" distB="0" distL="114300" distR="114300" simplePos="0" relativeHeight="251665408" behindDoc="0" locked="0" layoutInCell="1" allowOverlap="1" wp14:anchorId="3A34ECA4" wp14:editId="55F49B6C">
-                  <wp:simplePos x="0" y="0"/>
-                  <wp:positionH relativeFrom="column">
-                    <wp:posOffset>130810</wp:posOffset>
-                  </wp:positionH>
-                  <wp:positionV relativeFrom="paragraph">
-                    <wp:posOffset>2497455</wp:posOffset>
-                  </wp:positionV>
-                  <wp:extent cx="2073349" cy="3117860"/>
-                  <wp:effectExtent l="0" t="0" r="3175" b="6350"/>
-                  <wp:wrapSquare wrapText="bothSides"/>
-                  <wp:docPr id="1956220481" name="Рисунок 1"/>
-                  <wp:cNvGraphicFramePr>
-                    <a:graphicFrameLocks xmlns:a="http://schemas.openxmlformats.org/drawingml/2006/main" noChangeAspect="1"/>
-                  </wp:cNvGraphicFramePr>
-                  <a:graphic xmlns:a="http://schemas.openxmlformats.org/drawingml/2006/main">
-                    <a:graphicData uri="http://schemas.openxmlformats.org/drawingml/2006/picture">
-                      <pic:pic xmlns:pic="http://schemas.openxmlformats.org/drawingml/2006/picture">
-                        <pic:nvPicPr>
-                          <pic:cNvPr id="0" name="Picture 1"/>
-                          <pic:cNvPicPr>
-                            <a:picLocks noChangeAspect="1" noChangeArrowheads="1"/>
-                          </pic:cNvPicPr>
-                        </pic:nvPicPr>
-                        <pic:blipFill>
-                          <a:blip r:embed="rId14" cstate="print">
-                            <a:extLst>
-                              <a:ext uri="{28A0092B-C50C-407E-A947-70E740481C1C}">
-                                <a14:useLocalDpi xmlns:a14="http://schemas.microsoft.com/office/drawing/2010/main" val="0"/>
-                              </a:ext>
-                            </a:extLst>
-                          </a:blip>
-                          <a:srcRect/>
-                          <a:stretch>
-                            <a:fillRect/>
-                          </a:stretch>
-                        </pic:blipFill>
-                        <pic:spPr bwMode="auto">
-                          <a:xfrm>
-                            <a:off x="0" y="0"/>
-                            <a:ext cx="2073349" cy="3117860"/>
-                          </a:xfrm>
-                          <a:prstGeom prst="rect">
-                            <a:avLst/>
-                          </a:prstGeom>
-                          <a:noFill/>
-                          <a:ln>
-                            <a:noFill/>
-                          </a:ln>
-                        </pic:spPr>
-                      </pic:pic>
-                    </a:graphicData>
-                  </a:graphic>
-                  <wp14:sizeRelH relativeFrom="margin">
-                    <wp14:pctWidth>0</wp14:pctWidth>
-                  </wp14:sizeRelH>
-                  <wp14:sizeRelV relativeFrom="margin">
-                    <wp14:pctHeight>0</wp14:pctHeight>
-                  </wp14:sizeRelV>
-                </wp:anchor>
-              </w:drawing>
-            </w:r>
-          </w:p>
         </w:tc>
         <w:tc>
           <w:tcPr>
@@ -4633,60 +4178,6 @@
                 <w:lang w:val="ru-RU"/>
               </w:rPr>
             </w:pPr>
-          </w:p>
-          <w:p>
-            <w:pPr>
-              <w:jc w:val="both"/>
-              <w:rPr>
-                <w:rFonts w:ascii="Times New Roman" w:hAnsi="Times New Roman" w:cs="Times New Roman"/>
-                <w:sz w:val="24"/>
-                <w:szCs w:val="24"/>
-                <w:lang w:val="ru-RU"/>
-              </w:rPr>
-            </w:pPr>
-            <w:r>
-              <w:rPr>
-                <w:rFonts w:ascii="Times New Roman" w:hAnsi="Times New Roman" w:cs="Times New Roman"/>
-                <w:sz w:val="24"/>
-                <w:szCs w:val="24"/>
-                <w:lang w:val="ru-RU"/>
-              </w:rPr>
-              <w:drawing>
-                <wp:inline distT="0" distB="0" distL="0" distR="0" wp14:anchorId="2CA86804" wp14:editId="0DF889A1">
-                  <wp:extent cx="3096260" cy="1634956"/>
-                  <wp:effectExtent l="0" t="0" r="0" b="3810"/>
-                  <wp:docPr id="808326442" name="Рисунок 1"/>
-                  <wp:cNvGraphicFramePr>
-                    <a:graphicFrameLocks xmlns:a="http://schemas.openxmlformats.org/drawingml/2006/main" noChangeAspect="1"/>
-                  </wp:cNvGraphicFramePr>
-                  <a:graphic xmlns:a="http://schemas.openxmlformats.org/drawingml/2006/main">
-                    <a:graphicData uri="http://schemas.openxmlformats.org/drawingml/2006/picture">
-                      <pic:pic xmlns:pic="http://schemas.openxmlformats.org/drawingml/2006/picture">
-                        <pic:nvPicPr>
-                          <pic:cNvPr id="808326442" name=""/>
-                          <pic:cNvPicPr/>
-                        </pic:nvPicPr>
-                        <pic:blipFill>
-                          <a:blip r:embed="rId16"/>
-                          <a:stretch>
-                            <a:fillRect/>
-                          </a:stretch>
-                        </pic:blipFill>
-                        <pic:spPr>
-                          <a:xfrm>
-                            <a:off x="0" y="0"/>
-                            <a:ext cx="3117226" cy="1646027"/>
-                          </a:xfrm>
-                          <a:prstGeom prst="rect">
-                            <a:avLst/>
-                          </a:prstGeom>
-                        </pic:spPr>
-                      </pic:pic>
-                    </a:graphicData>
-                  </a:graphic>
-                </wp:inline>
-              </w:drawing>
-            </w:r>
           </w:p>
           <w:p>
             <w:pPr>

</xml_diff>